<commit_message>
Convert to a fully static, client-side app; drop Flask backend
Replace the Flask/docxtpl server with client-side docx generation using
docxtemplater + pizzip (vendored, MIT-licensed), so the report is built
and downloaded entirely in the browser with no server-side processing.

- Move templates/index.html to index.html at the repo root and rewrite
  its submit handler to fetch the .docx template, fill it in-browser,
  and trigger the download directly (no /generate endpoint).
- Simplify the docx template's placeholders from Jinja-style tags
  (e.g. {{ eyewitness.name|default('NIL') }}) to flat {{tag}} names
  (e.g. {{eyewitness_name}}), since docxtemplater doesn't parse dotted
  paths or filters; the "NIL" fallback logic now lives in index.html.
- Remove app.py, requirements.txt, and the templates/ folder.

Co-Authored-By: Claude Sonnet 5 <noreply@anthropic.com>
Claude-Session: https://claude.ai/code/session_01NuyUzxudwDkgyoYZR7ev8k
</commit_message>
<xml_diff>
--- a/docx_template/SCDF_Fire_Investigation_Report_TEMPLATE.docx
+++ b/docx_template/SCDF_Fire_Investigation_Report_TEMPLATE.docx
@@ -183,7 +183,7 @@
                 <w:color w:val="000000"/>
                 <w:sz w:val="24"/>
               </w:rPr>
-              <w:t>:  {{ investigator.name }}</w:t>
+              <w:t>:  {{investigator_name}}</w:t>
             </w:r>
           </w:p>
           <w:p>
@@ -205,21 +205,19 @@
               <w:rPr>
                 <w:color w:val="000000"/>
               </w:rPr>
-              <w:t xml:space="preserve"> {</w:t>
+              <w:t xml:space="preserve"> {{investigator_appointment}}</w:t>
             </w:r>
             <w:proofErr w:type="gramStart"/>
             <w:r>
               <w:rPr>
                 <w:color w:val="000000"/>
               </w:rPr>
-              <w:t xml:space="preserve">{ </w:t>
             </w:r>
             <w:proofErr w:type="spellStart"/>
             <w:r>
               <w:rPr>
                 <w:color w:val="000000"/>
               </w:rPr>
-              <w:t>investigator.appointment</w:t>
             </w:r>
             <w:proofErr w:type="spellEnd"/>
             <w:proofErr w:type="gramEnd"/>
@@ -227,7 +225,6 @@
               <w:rPr>
                 <w:color w:val="000000"/>
               </w:rPr>
-              <w:t xml:space="preserve"> }}</w:t>
             </w:r>
           </w:p>
           <w:p>
@@ -249,21 +246,19 @@
               <w:rPr>
                 <w:color w:val="000000"/>
               </w:rPr>
-              <w:t xml:space="preserve"> {</w:t>
+              <w:t xml:space="preserve"> {{investigator_station}}</w:t>
             </w:r>
             <w:proofErr w:type="gramStart"/>
             <w:r>
               <w:rPr>
                 <w:color w:val="000000"/>
               </w:rPr>
-              <w:t xml:space="preserve">{ </w:t>
             </w:r>
             <w:proofErr w:type="spellStart"/>
             <w:r>
               <w:rPr>
                 <w:color w:val="000000"/>
               </w:rPr>
-              <w:t>investigator.station</w:t>
             </w:r>
             <w:proofErr w:type="spellEnd"/>
             <w:proofErr w:type="gramEnd"/>
@@ -271,7 +266,6 @@
               <w:rPr>
                 <w:color w:val="000000"/>
               </w:rPr>
-              <w:t xml:space="preserve"> }}</w:t>
             </w:r>
           </w:p>
         </w:tc>
@@ -310,7 +304,7 @@
                 <w:color w:val="000000"/>
                 <w:sz w:val="24"/>
               </w:rPr>
-              <w:t xml:space="preserve"> {{ </w:t>
+              <w:t xml:space="preserve"> {{incident_no}}</w:t>
             </w:r>
             <w:proofErr w:type="spellStart"/>
             <w:r>
@@ -319,7 +313,6 @@
                 <w:color w:val="000000"/>
                 <w:sz w:val="24"/>
               </w:rPr>
-              <w:t>incident_no</w:t>
             </w:r>
             <w:proofErr w:type="spellEnd"/>
             <w:r>
@@ -328,7 +321,6 @@
                 <w:color w:val="000000"/>
                 <w:sz w:val="24"/>
               </w:rPr>
-              <w:t xml:space="preserve"> }}</w:t>
             </w:r>
           </w:p>
         </w:tc>
@@ -382,7 +374,7 @@
                 <w:sz w:val="24"/>
                 <w:szCs w:val="24"/>
               </w:rPr>
-              <w:t xml:space="preserve">{{ </w:t>
+              <w:t>{{address_of_fire}}</w:t>
             </w:r>
             <w:proofErr w:type="spellStart"/>
             <w:r>
@@ -391,7 +383,6 @@
                 <w:sz w:val="24"/>
                 <w:szCs w:val="24"/>
               </w:rPr>
-              <w:t>address</w:t>
             </w:r>
             <w:r>
               <w:rPr>
@@ -399,7 +390,6 @@
                 <w:sz w:val="24"/>
                 <w:szCs w:val="24"/>
               </w:rPr>
-              <w:t>_of_fire</w:t>
             </w:r>
             <w:proofErr w:type="spellEnd"/>
             <w:r>
@@ -408,7 +398,6 @@
                 <w:sz w:val="24"/>
                 <w:szCs w:val="24"/>
               </w:rPr>
-              <w:t xml:space="preserve"> }}</w:t>
             </w:r>
           </w:p>
         </w:tc>
@@ -448,7 +437,7 @@
                 <w:color w:val="000000"/>
                 <w:sz w:val="24"/>
               </w:rPr>
-              <w:t xml:space="preserve"> {{ </w:t>
+              <w:t xml:space="preserve"> {{date_of_fire}}</w:t>
             </w:r>
             <w:proofErr w:type="spellStart"/>
             <w:r>
@@ -457,7 +446,6 @@
                 <w:color w:val="000000"/>
                 <w:sz w:val="24"/>
               </w:rPr>
-              <w:t>date_of_fire</w:t>
             </w:r>
             <w:proofErr w:type="spellEnd"/>
             <w:r>
@@ -466,7 +454,6 @@
                 <w:color w:val="000000"/>
                 <w:sz w:val="24"/>
               </w:rPr>
-              <w:t xml:space="preserve"> }}</w:t>
             </w:r>
           </w:p>
         </w:tc>
@@ -530,7 +517,7 @@
                 <w:rFonts w:ascii="Arial" w:hAnsi="Arial"/>
                 <w:sz w:val="24"/>
               </w:rPr>
-              <w:t xml:space="preserve">{{ </w:t>
+              <w:t>{{time_of_call}}</w:t>
             </w:r>
             <w:proofErr w:type="spellStart"/>
             <w:r>
@@ -538,7 +525,6 @@
                 <w:rFonts w:ascii="Arial" w:hAnsi="Arial"/>
                 <w:sz w:val="24"/>
               </w:rPr>
-              <w:t>time_of_call</w:t>
             </w:r>
             <w:proofErr w:type="spellEnd"/>
             <w:r>
@@ -546,7 +532,6 @@
                 <w:rFonts w:ascii="Arial" w:hAnsi="Arial"/>
                 <w:sz w:val="24"/>
               </w:rPr>
-              <w:t xml:space="preserve"> }}</w:t>
             </w:r>
           </w:p>
         </w:tc>
@@ -623,7 +608,7 @@
                 <w:color w:val="000000"/>
                 <w:sz w:val="24"/>
               </w:rPr>
-              <w:t xml:space="preserve">{{ </w:t>
+              <w:t>{{investigator_station}}</w:t>
             </w:r>
             <w:proofErr w:type="spellStart"/>
             <w:r>
@@ -632,7 +617,6 @@
                 <w:color w:val="000000"/>
                 <w:sz w:val="24"/>
               </w:rPr>
-              <w:t>investigator.station</w:t>
             </w:r>
             <w:proofErr w:type="spellEnd"/>
             <w:r>
@@ -641,7 +625,6 @@
                 <w:color w:val="000000"/>
                 <w:sz w:val="24"/>
               </w:rPr>
-              <w:t xml:space="preserve"> }}</w:t>
             </w:r>
           </w:p>
         </w:tc>
@@ -758,7 +741,7 @@
                 <w:sz w:val="24"/>
                 <w:szCs w:val="24"/>
               </w:rPr>
-              <w:t xml:space="preserve">{{ </w:t>
+              <w:t>{{fire_involved}}</w:t>
             </w:r>
             <w:proofErr w:type="spellStart"/>
             <w:r>
@@ -767,7 +750,6 @@
                 <w:sz w:val="24"/>
                 <w:szCs w:val="24"/>
               </w:rPr>
-              <w:t>fire_involved</w:t>
             </w:r>
             <w:proofErr w:type="spellEnd"/>
             <w:r>
@@ -776,7 +758,6 @@
                 <w:sz w:val="24"/>
                 <w:szCs w:val="24"/>
               </w:rPr>
-              <w:t xml:space="preserve"> }}</w:t>
             </w:r>
           </w:p>
         </w:tc>
@@ -890,7 +871,7 @@
                 <w:i w:val="0"/>
                 <w:color w:val="auto"/>
               </w:rPr>
-              <w:t>{</w:t>
+              <w:t>{{method_of_extinguishment}}</w:t>
             </w:r>
             <w:proofErr w:type="gramStart"/>
             <w:r>
@@ -898,7 +879,6 @@
                 <w:i w:val="0"/>
                 <w:color w:val="auto"/>
               </w:rPr>
-              <w:t xml:space="preserve">{ </w:t>
             </w:r>
             <w:proofErr w:type="spellStart"/>
             <w:r>
@@ -906,7 +886,6 @@
                 <w:i w:val="0"/>
                 <w:color w:val="auto"/>
               </w:rPr>
-              <w:t>method</w:t>
             </w:r>
             <w:proofErr w:type="gramEnd"/>
             <w:r>
@@ -914,7 +893,6 @@
                 <w:i w:val="0"/>
                 <w:color w:val="auto"/>
               </w:rPr>
-              <w:t>_of_extinguishment</w:t>
             </w:r>
             <w:proofErr w:type="spellEnd"/>
             <w:r>
@@ -922,7 +900,6 @@
                 <w:i w:val="0"/>
                 <w:color w:val="auto"/>
               </w:rPr>
-              <w:t xml:space="preserve"> }}</w:t>
             </w:r>
           </w:p>
           <w:p>
@@ -991,7 +968,7 @@
                 <w:sz w:val="24"/>
                 <w:szCs w:val="24"/>
               </w:rPr>
-              <w:t xml:space="preserve">{{ </w:t>
+              <w:t>{{damages_sustained}}</w:t>
             </w:r>
             <w:proofErr w:type="spellStart"/>
             <w:r>
@@ -1000,7 +977,6 @@
                 <w:sz w:val="24"/>
                 <w:szCs w:val="24"/>
               </w:rPr>
-              <w:t>damages_sustained</w:t>
             </w:r>
             <w:proofErr w:type="spellEnd"/>
             <w:r>
@@ -1009,7 +985,6 @@
                 <w:sz w:val="24"/>
                 <w:szCs w:val="24"/>
               </w:rPr>
-              <w:t xml:space="preserve"> }}</w:t>
             </w:r>
           </w:p>
           <w:p>
@@ -1174,24 +1149,16 @@
               <w:pStyle w:val="Heading3"/>
             </w:pPr>
             <w:r>
-              <w:t>{</w:t>
+              <w:t>{{eyewitness_name}}</w:t>
             </w:r>
             <w:proofErr w:type="gramStart"/>
-            <w:r>
-              <w:t xml:space="preserve">{ </w:t>
-            </w:r>
+            <w:r/>
             <w:proofErr w:type="spellStart"/>
-            <w:r>
-              <w:t>eyewitness.name</w:t>
-            </w:r>
+            <w:r/>
             <w:proofErr w:type="gramEnd"/>
-            <w:r>
-              <w:t>|default</w:t>
-            </w:r>
+            <w:r/>
             <w:proofErr w:type="spellEnd"/>
-            <w:r>
-              <w:t>('NIL') }}</w:t>
-            </w:r>
+            <w:r/>
           </w:p>
         </w:tc>
       </w:tr>
@@ -1244,7 +1211,7 @@
                 <w:rFonts w:ascii="Arial" w:hAnsi="Arial"/>
                 <w:sz w:val="24"/>
               </w:rPr>
-              <w:t xml:space="preserve">{{ </w:t>
+              <w:t>{{eyewitness_designation}}</w:t>
             </w:r>
             <w:proofErr w:type="spellStart"/>
             <w:r>
@@ -1252,7 +1219,6 @@
                 <w:rFonts w:ascii="Arial" w:hAnsi="Arial"/>
                 <w:sz w:val="24"/>
               </w:rPr>
-              <w:t>eyewitness.designation|default</w:t>
             </w:r>
             <w:proofErr w:type="spellEnd"/>
             <w:r>
@@ -1260,7 +1226,6 @@
                 <w:rFonts w:ascii="Arial" w:hAnsi="Arial"/>
                 <w:sz w:val="24"/>
               </w:rPr>
-              <w:t>('NIL') }}</w:t>
             </w:r>
           </w:p>
         </w:tc>
@@ -1314,7 +1279,7 @@
                 <w:rFonts w:ascii="Arial" w:hAnsi="Arial"/>
                 <w:sz w:val="24"/>
               </w:rPr>
-              <w:t xml:space="preserve">{{ </w:t>
+              <w:t>{{eyewitness_nric}}</w:t>
             </w:r>
             <w:proofErr w:type="spellStart"/>
             <w:r>
@@ -1322,7 +1287,6 @@
                 <w:rFonts w:ascii="Arial" w:hAnsi="Arial"/>
                 <w:sz w:val="24"/>
               </w:rPr>
-              <w:t>eyewitness.nric|default</w:t>
             </w:r>
             <w:proofErr w:type="spellEnd"/>
             <w:r>
@@ -1330,7 +1294,6 @@
                 <w:rFonts w:ascii="Arial" w:hAnsi="Arial"/>
                 <w:sz w:val="24"/>
               </w:rPr>
-              <w:t>('NIL') }}</w:t>
             </w:r>
           </w:p>
         </w:tc>
@@ -1376,24 +1339,16 @@
               <w:pStyle w:val="Heading3"/>
             </w:pPr>
             <w:r>
-              <w:t>{</w:t>
+              <w:t>{{eyewitness_nationality}}</w:t>
             </w:r>
             <w:proofErr w:type="gramStart"/>
-            <w:r>
-              <w:t xml:space="preserve">{ </w:t>
-            </w:r>
+            <w:r/>
             <w:proofErr w:type="spellStart"/>
-            <w:r>
-              <w:t>eyewitness.nationality</w:t>
-            </w:r>
+            <w:r/>
             <w:proofErr w:type="gramEnd"/>
-            <w:r>
-              <w:t>|default</w:t>
-            </w:r>
+            <w:r/>
             <w:proofErr w:type="spellEnd"/>
-            <w:r>
-              <w:t>('NIL') }}</w:t>
-            </w:r>
+            <w:r/>
           </w:p>
         </w:tc>
       </w:tr>
@@ -1447,7 +1402,7 @@
                 <w:rFonts w:ascii="Arial" w:hAnsi="Arial"/>
                 <w:sz w:val="24"/>
               </w:rPr>
-              <w:t xml:space="preserve">{{ </w:t>
+              <w:t>{{eyewitness_address}}</w:t>
             </w:r>
             <w:proofErr w:type="spellStart"/>
             <w:r>
@@ -1455,7 +1410,6 @@
                 <w:rFonts w:ascii="Arial" w:hAnsi="Arial"/>
                 <w:sz w:val="24"/>
               </w:rPr>
-              <w:t>eyewitness.address|default</w:t>
             </w:r>
             <w:proofErr w:type="spellEnd"/>
             <w:r>
@@ -1463,7 +1417,6 @@
                 <w:rFonts w:ascii="Arial" w:hAnsi="Arial"/>
                 <w:sz w:val="24"/>
               </w:rPr>
-              <w:t>('NIL') }}</w:t>
             </w:r>
           </w:p>
         </w:tc>
@@ -1516,7 +1469,7 @@
                 <w:rFonts w:ascii="Arial" w:hAnsi="Arial"/>
                 <w:sz w:val="24"/>
               </w:rPr>
-              <w:t xml:space="preserve">{{ </w:t>
+              <w:t>{{eyewitness_contact}}</w:t>
             </w:r>
             <w:proofErr w:type="spellStart"/>
             <w:r>
@@ -1524,7 +1477,6 @@
                 <w:rFonts w:ascii="Arial" w:hAnsi="Arial"/>
                 <w:sz w:val="24"/>
               </w:rPr>
-              <w:t>eyewitness.contact|default</w:t>
             </w:r>
             <w:proofErr w:type="spellEnd"/>
             <w:r>
@@ -1532,7 +1484,6 @@
                 <w:rFonts w:ascii="Arial" w:hAnsi="Arial"/>
                 <w:sz w:val="24"/>
               </w:rPr>
-              <w:t>('NIL') }}</w:t>
             </w:r>
           </w:p>
         </w:tc>
@@ -1783,7 +1734,7 @@
                 <w:i w:val="0"/>
                 <w:color w:val="auto"/>
               </w:rPr>
-              <w:t>{</w:t>
+              <w:t>{{insured_mark_no}}</w:t>
             </w:r>
             <w:proofErr w:type="gramStart"/>
             <w:r>
@@ -1792,7 +1743,6 @@
                 <w:i w:val="0"/>
                 <w:color w:val="auto"/>
               </w:rPr>
-              <w:t xml:space="preserve">{ </w:t>
             </w:r>
             <w:proofErr w:type="spellStart"/>
             <w:r>
@@ -1801,7 +1751,6 @@
                 <w:i w:val="0"/>
                 <w:color w:val="auto"/>
               </w:rPr>
-              <w:t>insured</w:t>
             </w:r>
             <w:proofErr w:type="gramEnd"/>
             <w:r>
@@ -1810,7 +1759,6 @@
                 <w:i w:val="0"/>
                 <w:color w:val="auto"/>
               </w:rPr>
-              <w:t>_mark_no</w:t>
             </w:r>
             <w:proofErr w:type="spellEnd"/>
             <w:r>
@@ -1819,7 +1767,6 @@
                 <w:i w:val="0"/>
                 <w:color w:val="auto"/>
               </w:rPr>
-              <w:t xml:space="preserve"> }}</w:t>
             </w:r>
             <w:r>
               <w:rPr>
@@ -1980,7 +1927,7 @@
                 <w:color w:val="000000"/>
                 <w:sz w:val="24"/>
               </w:rPr>
-              <w:t xml:space="preserve">{{ </w:t>
+              <w:t>{{ignition_source}}</w:t>
             </w:r>
             <w:proofErr w:type="spellStart"/>
             <w:r>
@@ -1989,7 +1936,6 @@
                 <w:color w:val="000000"/>
                 <w:sz w:val="24"/>
               </w:rPr>
-              <w:t>ignition_source</w:t>
             </w:r>
             <w:proofErr w:type="spellEnd"/>
             <w:r>
@@ -1998,7 +1944,6 @@
                 <w:color w:val="000000"/>
                 <w:sz w:val="24"/>
               </w:rPr>
-              <w:t xml:space="preserve"> }}</w:t>
             </w:r>
           </w:p>
           <w:p>
@@ -2060,7 +2005,7 @@
                 <w:i w:val="0"/>
                 <w:color w:val="auto"/>
               </w:rPr>
-              <w:t>{</w:t>
+              <w:t>{{ignition_fuels}}</w:t>
             </w:r>
             <w:proofErr w:type="gramStart"/>
             <w:r>
@@ -2068,7 +2013,6 @@
                 <w:i w:val="0"/>
                 <w:color w:val="auto"/>
               </w:rPr>
-              <w:t xml:space="preserve">{ </w:t>
             </w:r>
             <w:proofErr w:type="spellStart"/>
             <w:r>
@@ -2076,7 +2020,6 @@
                 <w:i w:val="0"/>
                 <w:color w:val="auto"/>
               </w:rPr>
-              <w:t>ignition</w:t>
             </w:r>
             <w:proofErr w:type="gramEnd"/>
             <w:r>
@@ -2084,7 +2027,6 @@
                 <w:i w:val="0"/>
                 <w:color w:val="auto"/>
               </w:rPr>
-              <w:t>_fuels</w:t>
             </w:r>
             <w:proofErr w:type="spellEnd"/>
             <w:r>
@@ -2092,7 +2034,6 @@
                 <w:i w:val="0"/>
                 <w:color w:val="auto"/>
               </w:rPr>
-              <w:t xml:space="preserve"> }}</w:t>
             </w:r>
           </w:p>
         </w:tc>
@@ -2155,7 +2096,7 @@
                 <w:sz w:val="24"/>
                 <w:szCs w:val="24"/>
               </w:rPr>
-              <w:t xml:space="preserve">{{ </w:t>
+              <w:t>{{events_leading_to_incident}}</w:t>
             </w:r>
             <w:proofErr w:type="spellStart"/>
             <w:r>
@@ -2164,7 +2105,6 @@
                 <w:sz w:val="24"/>
                 <w:szCs w:val="24"/>
               </w:rPr>
-              <w:t>events_leading_to_incident</w:t>
             </w:r>
             <w:proofErr w:type="spellEnd"/>
             <w:r>
@@ -2173,7 +2113,6 @@
                 <w:sz w:val="24"/>
                 <w:szCs w:val="24"/>
               </w:rPr>
-              <w:t xml:space="preserve"> }}</w:t>
             </w:r>
           </w:p>
           <w:p>
@@ -2444,7 +2383,7 @@
                 <w:sz w:val="24"/>
                 <w:szCs w:val="24"/>
               </w:rPr>
-              <w:t xml:space="preserve">{{ </w:t>
+              <w:t>{{burn_patterns_observed}}</w:t>
             </w:r>
             <w:proofErr w:type="spellStart"/>
             <w:r>
@@ -2453,7 +2392,6 @@
                 <w:sz w:val="24"/>
                 <w:szCs w:val="24"/>
               </w:rPr>
-              <w:t>burn_patterns_observed</w:t>
             </w:r>
             <w:proofErr w:type="spellEnd"/>
             <w:r>
@@ -2462,7 +2400,6 @@
                 <w:sz w:val="24"/>
                 <w:szCs w:val="24"/>
               </w:rPr>
-              <w:t xml:space="preserve"> }}</w:t>
             </w:r>
           </w:p>
         </w:tc>
@@ -2634,7 +2571,7 @@
                 <w:sz w:val="24"/>
                 <w:szCs w:val="24"/>
               </w:rPr>
-              <w:t xml:space="preserve">{{ </w:t>
+              <w:t>{{evidence_at_scene}}</w:t>
             </w:r>
             <w:proofErr w:type="spellStart"/>
             <w:r>
@@ -2643,7 +2580,6 @@
                 <w:sz w:val="24"/>
                 <w:szCs w:val="24"/>
               </w:rPr>
-              <w:t>evidence_at_scene</w:t>
             </w:r>
             <w:proofErr w:type="spellEnd"/>
             <w:r>
@@ -2652,7 +2588,6 @@
                 <w:sz w:val="24"/>
                 <w:szCs w:val="24"/>
               </w:rPr>
-              <w:t xml:space="preserve"> }}</w:t>
             </w:r>
           </w:p>
         </w:tc>
@@ -3058,7 +2993,7 @@
                 <w:spacing w:val="-2"/>
                 <w:sz w:val="24"/>
               </w:rPr>
-              <w:t xml:space="preserve">{{ </w:t>
+              <w:t>{{other_information}}</w:t>
             </w:r>
             <w:proofErr w:type="spellStart"/>
             <w:r>
@@ -3067,7 +3002,6 @@
                 <w:spacing w:val="-2"/>
                 <w:sz w:val="24"/>
               </w:rPr>
-              <w:t>other_information</w:t>
             </w:r>
             <w:proofErr w:type="spellEnd"/>
             <w:r>
@@ -3076,7 +3010,6 @@
                 <w:spacing w:val="-2"/>
                 <w:sz w:val="24"/>
               </w:rPr>
-              <w:t xml:space="preserve"> }}</w:t>
             </w:r>
           </w:p>
           <w:p>
@@ -3699,7 +3632,7 @@
           <w:spacing w:val="-2"/>
           <w:sz w:val="24"/>
         </w:rPr>
-        <w:t>{</w:t>
+        <w:t>{{investigator_rank_and_name}}</w:t>
       </w:r>
       <w:proofErr w:type="gramStart"/>
       <w:r>
@@ -3708,7 +3641,6 @@
           <w:spacing w:val="-2"/>
           <w:sz w:val="24"/>
         </w:rPr>
-        <w:t xml:space="preserve">{ </w:t>
       </w:r>
       <w:proofErr w:type="spellStart"/>
       <w:r>
@@ -3717,7 +3649,6 @@
           <w:spacing w:val="-2"/>
           <w:sz w:val="24"/>
         </w:rPr>
-        <w:t>investigator</w:t>
       </w:r>
       <w:proofErr w:type="gramEnd"/>
       <w:r>
@@ -3726,7 +3657,6 @@
           <w:spacing w:val="-2"/>
           <w:sz w:val="24"/>
         </w:rPr>
-        <w:t>_rank_and_name</w:t>
       </w:r>
       <w:proofErr w:type="spellEnd"/>
       <w:r>
@@ -3735,7 +3665,6 @@
           <w:spacing w:val="-2"/>
           <w:sz w:val="24"/>
         </w:rPr>
-        <w:t xml:space="preserve"> }}</w:t>
       </w:r>
     </w:p>
     <w:p>
@@ -3772,7 +3701,7 @@
           <w:sz w:val="24"/>
           <w:szCs w:val="24"/>
         </w:rPr>
-        <w:t>{</w:t>
+        <w:t>{{investigator_appointment}}</w:t>
       </w:r>
       <w:proofErr w:type="gramStart"/>
       <w:r>
@@ -3781,7 +3710,6 @@
           <w:sz w:val="24"/>
           <w:szCs w:val="24"/>
         </w:rPr>
-        <w:t xml:space="preserve">{ </w:t>
       </w:r>
       <w:proofErr w:type="spellStart"/>
       <w:r>
@@ -3790,7 +3718,6 @@
           <w:sz w:val="24"/>
           <w:szCs w:val="24"/>
         </w:rPr>
-        <w:t>investigator.appointment</w:t>
       </w:r>
       <w:proofErr w:type="spellEnd"/>
       <w:proofErr w:type="gramEnd"/>
@@ -3800,7 +3727,6 @@
           <w:sz w:val="24"/>
           <w:szCs w:val="24"/>
         </w:rPr>
-        <w:t xml:space="preserve"> }}</w:t>
       </w:r>
     </w:p>
     <w:p>
@@ -4648,7 +4574,7 @@
           <w:color w:val="000000"/>
           <w:sz w:val="24"/>
         </w:rPr>
-        <w:t xml:space="preserve">{{ </w:t>
+        <w:t>{{date_of_fire}}</w:t>
       </w:r>
       <w:proofErr w:type="spellStart"/>
       <w:r>
@@ -4657,7 +4583,6 @@
           <w:color w:val="000000"/>
           <w:sz w:val="24"/>
         </w:rPr>
-        <w:t>date_of_fire</w:t>
       </w:r>
       <w:proofErr w:type="spellEnd"/>
       <w:r>
@@ -4666,13 +4591,15 @@
           <w:color w:val="000000"/>
           <w:sz w:val="24"/>
         </w:rPr>
-        <w:t xml:space="preserve"> }}</w:t>
       </w:r>
     </w:p>
     <w:sectPr>
       <w:headerReference w:type="default" r:id="rId11"/>
       <w:footerReference w:type="even" r:id="rId12"/>
       <w:footerReference w:type="default" r:id="rId13"/>
+      <w:headerReference w:type="first" r:id="rId16"/>
+      <w:headerReference w:type="even" r:id="rId17"/>
+      <w:footerReference w:type="first" r:id="rId18"/>
       <w:pgSz w:w="12240" w:h="15840"/>
       <w:pgMar w:top="720" w:right="1080" w:bottom="1440" w:left="1800" w:header="720" w:footer="720" w:gutter="0"/>
       <w:cols w:space="720"/>
@@ -4830,6 +4757,16 @@
 </w:ftr>
 </file>
 
+<file path=word/footer3.xml><?xml version="1.0" encoding="utf-8"?>
+<w:ftr xmlns:m="http://schemas.openxmlformats.org/officeDocument/2006/math" xmlns:mc="http://schemas.openxmlformats.org/markup-compatibility/2006" xmlns:mo="http://schemas.microsoft.com/office/mac/office/2008/main" xmlns:mv="urn:schemas-microsoft-com:mac:vml" xmlns:o="urn:schemas-microsoft-com:office:office" xmlns:r="http://schemas.openxmlformats.org/officeDocument/2006/relationships" xmlns:v="urn:schemas-microsoft-com:vml" xmlns:w10="urn:schemas-microsoft-com:office:word" xmlns:w14="http://schemas.microsoft.com/office/word/2010/wordml" xmlns:w="http://schemas.openxmlformats.org/wordprocessingml/2006/main" xmlns:wne="http://schemas.microsoft.com/office/word/2006/wordml" xmlns:wp14="http://schemas.microsoft.com/office/word/2010/wordprocessingDrawing" xmlns:wp="http://schemas.openxmlformats.org/drawingml/2006/wordprocessingDrawing" xmlns:wpc="http://schemas.microsoft.com/office/word/2010/wordprocessingCanvas" xmlns:wpg="http://schemas.microsoft.com/office/word/2010/wordprocessingGroup" xmlns:wpi="http://schemas.microsoft.com/office/word/2010/wordprocessingInk" xmlns:wps="http://schemas.microsoft.com/office/word/2010/wordprocessingShape" mc:Ignorable="w14 wp14">
+  <w:p>
+    <w:pPr>
+      <w:pStyle w:val="Footer"/>
+    </w:pPr>
+  </w:p>
+</w:ftr>
+</file>
+
 <file path=word/footnotes.xml><?xml version="1.0" encoding="utf-8"?>
 <w:footnotes xmlns:wpc="http://schemas.microsoft.com/office/word/2010/wordprocessingCanvas" xmlns:mc="http://schemas.openxmlformats.org/markup-compatibility/2006" xmlns:o="urn:schemas-microsoft-com:office:office" xmlns:r="http://schemas.openxmlformats.org/officeDocument/2006/relationships" xmlns:m="http://schemas.openxmlformats.org/officeDocument/2006/math" xmlns:v="urn:schemas-microsoft-com:vml" xmlns:wp14="http://schemas.microsoft.com/office/word/2010/wordprocessingDrawing" xmlns:wp="http://schemas.openxmlformats.org/drawingml/2006/wordprocessingDrawing" xmlns:w10="urn:schemas-microsoft-com:office:word" xmlns:w="http://schemas.openxmlformats.org/wordprocessingml/2006/main" xmlns:w14="http://schemas.microsoft.com/office/word/2010/wordml" xmlns:wpg="http://schemas.microsoft.com/office/word/2010/wordprocessingGroup" xmlns:wpi="http://schemas.microsoft.com/office/word/2010/wordprocessingInk" xmlns:wne="http://schemas.microsoft.com/office/word/2006/wordml" xmlns:wps="http://schemas.microsoft.com/office/word/2010/wordprocessingShape" mc:Ignorable="w14 wp14">
   <w:footnote w:type="separator" w:id="-1">
@@ -4877,6 +4814,26 @@
         <w:sz w:val="24"/>
         <w:u w:val="single"/>
       </w:rPr>
+    </w:pPr>
+  </w:p>
+</w:hdr>
+</file>
+
+<file path=word/header2.xml><?xml version="1.0" encoding="utf-8"?>
+<w:hdr xmlns:m="http://schemas.openxmlformats.org/officeDocument/2006/math" xmlns:mc="http://schemas.openxmlformats.org/markup-compatibility/2006" xmlns:mo="http://schemas.microsoft.com/office/mac/office/2008/main" xmlns:mv="urn:schemas-microsoft-com:mac:vml" xmlns:o="urn:schemas-microsoft-com:office:office" xmlns:r="http://schemas.openxmlformats.org/officeDocument/2006/relationships" xmlns:v="urn:schemas-microsoft-com:vml" xmlns:w10="urn:schemas-microsoft-com:office:word" xmlns:w14="http://schemas.microsoft.com/office/word/2010/wordml" xmlns:w="http://schemas.openxmlformats.org/wordprocessingml/2006/main" xmlns:wne="http://schemas.microsoft.com/office/word/2006/wordml" xmlns:wp14="http://schemas.microsoft.com/office/word/2010/wordprocessingDrawing" xmlns:wp="http://schemas.openxmlformats.org/drawingml/2006/wordprocessingDrawing" xmlns:wpc="http://schemas.microsoft.com/office/word/2010/wordprocessingCanvas" xmlns:wpg="http://schemas.microsoft.com/office/word/2010/wordprocessingGroup" xmlns:wpi="http://schemas.microsoft.com/office/word/2010/wordprocessingInk" xmlns:wps="http://schemas.microsoft.com/office/word/2010/wordprocessingShape" mc:Ignorable="w14 wp14">
+  <w:p>
+    <w:pPr>
+      <w:pStyle w:val="Header"/>
+    </w:pPr>
+  </w:p>
+</w:hdr>
+</file>
+
+<file path=word/header3.xml><?xml version="1.0" encoding="utf-8"?>
+<w:hdr xmlns:m="http://schemas.openxmlformats.org/officeDocument/2006/math" xmlns:mc="http://schemas.openxmlformats.org/markup-compatibility/2006" xmlns:mo="http://schemas.microsoft.com/office/mac/office/2008/main" xmlns:mv="urn:schemas-microsoft-com:mac:vml" xmlns:o="urn:schemas-microsoft-com:office:office" xmlns:r="http://schemas.openxmlformats.org/officeDocument/2006/relationships" xmlns:v="urn:schemas-microsoft-com:vml" xmlns:w10="urn:schemas-microsoft-com:office:word" xmlns:w14="http://schemas.microsoft.com/office/word/2010/wordml" xmlns:w="http://schemas.openxmlformats.org/wordprocessingml/2006/main" xmlns:wne="http://schemas.microsoft.com/office/word/2006/wordml" xmlns:wp14="http://schemas.microsoft.com/office/word/2010/wordprocessingDrawing" xmlns:wp="http://schemas.openxmlformats.org/drawingml/2006/wordprocessingDrawing" xmlns:wpc="http://schemas.microsoft.com/office/word/2010/wordprocessingCanvas" xmlns:wpg="http://schemas.microsoft.com/office/word/2010/wordprocessingGroup" xmlns:wpi="http://schemas.microsoft.com/office/word/2010/wordprocessingInk" xmlns:wps="http://schemas.microsoft.com/office/word/2010/wordprocessingShape" mc:Ignorable="w14 wp14">
+  <w:p>
+    <w:pPr>
+      <w:pStyle w:val="Header"/>
     </w:pPr>
   </w:p>
 </w:hdr>

</xml_diff>